<commit_message>
docs(report): cap nhat bao cao thuc tap Word, slide va thong tin mat khau ha tang cloud 24/7
- Cap nhat file Word Bao_Cao_Thuc_Tap_He_Thong_Dat_Lich_Salon_Spa.docx: bo sung lich su phat hanh tu v1.5.0 den v2.2.1, kien truc trien khai dam may 24/7 (Supabase, Render, Cloudflare Pages, Worker keepalive)

- Cap nhat Slide_Bao_Cao_He_Thong_Dat_Lich_Salon_Spa.pptx dong bo so lieu he thong

- Tao tai lieu mk/pass.docx luu tru thong tin ket noi Cloud 24/7, tai khoan Admin va huong dan tich hop Render/Cloudflare MCP

- Bo sung script keepalive va wrangler vao package.json, bo sung quy tac bo qua vao .gitignore
</commit_message>
<xml_diff>
--- a/docs/reports/Bao_Cao_Thuc_Tap_He_Thong_Dat_Lich_Salon_Spa.docx
+++ b/docs/reports/Bao_Cao_Thuc_Tap_He_Thong_Dat_Lich_Salon_Spa.docx
@@ -12920,7 +12920,7 @@
                 <w:i w:val="0"/>
                 <w:sz w:val="26"/>
               </w:rPr>
-              <w:t>1. Trình bày</w:t>
+              <w:t>1. Trình bày (Cloud/Local)</w:t>
             </w:r>
           </w:p>
         </w:tc>
@@ -12942,7 +12942,7 @@
                 <w:i w:val="0"/>
                 <w:sz w:val="26"/>
               </w:rPr>
-              <w:t>React 18 + Vite</w:t>
+              <w:t>React 18 + Vite (Cloudflare Pages CDN)</w:t>
             </w:r>
           </w:p>
         </w:tc>
@@ -12964,7 +12964,7 @@
                 <w:i w:val="0"/>
                 <w:sz w:val="26"/>
               </w:rPr>
-              <w:t>Trang công khai và quản lý; nhận SSE để làm mới dữ liệu</w:t>
+              <w:t>Trang công khai và quản lý; nhận SSE; triển khai đám mây toàn cầu https://huongsen-salon.pages.dev</w:t>
             </w:r>
           </w:p>
         </w:tc>
@@ -13013,7 +13013,7 @@
                 <w:i w:val="0"/>
                 <w:sz w:val="26"/>
               </w:rPr>
-              <w:t>NestJS 10 Controller, DTO, Guard</w:t>
+              <w:t>NestJS 10 (Render Cloud Service)</w:t>
             </w:r>
           </w:p>
         </w:tc>
@@ -13035,7 +13035,7 @@
                 <w:i w:val="0"/>
                 <w:sz w:val="26"/>
               </w:rPr>
-              <w:t>REST/JSON; xác thực JWT; kiểm tra dữ liệu và phân quyền</w:t>
+              <w:t>REST/JSON, JWT, CORS; triển khai backend 24/7 https://salon-spa-api-93d7.onrender.com</w:t>
             </w:r>
           </w:p>
         </w:tc>
@@ -13062,7 +13062,7 @@
                 <w:i w:val="0"/>
                 <w:sz w:val="26"/>
               </w:rPr>
-              <w:t>3. Nghiệp vụ</w:t>
+              <w:t>3. Nghiệp vụ &amp; Vận hành</w:t>
             </w:r>
           </w:p>
         </w:tc>
@@ -13084,7 +13084,7 @@
                 <w:i w:val="0"/>
                 <w:sz w:val="26"/>
               </w:rPr>
-              <w:t>NestJS Service</w:t>
+              <w:t>NestJS Service + Cloudflare Worker</w:t>
             </w:r>
           </w:p>
         </w:tc>
@@ -13106,7 +13106,7 @@
                 <w:i w:val="0"/>
                 <w:sz w:val="26"/>
               </w:rPr>
-              <w:t>Tính khung giờ, ngày nghỉ, vòng đời lịch, thanh toán; phát sự kiện sau commit</w:t>
+              <w:t>Tính khung giờ, ca làm, giữ chỗ; Worker cron 10 phút giữ thức API 24/7</w:t>
             </w:r>
           </w:p>
         </w:tc>
@@ -13153,7 +13153,7 @@
                 <w:i w:val="0"/>
                 <w:sz w:val="26"/>
               </w:rPr>
-              <w:t>TypeORM Repository + PostgreSQL</w:t>
+              <w:t>TypeORM + Supabase PostgreSQL 17</w:t>
             </w:r>
           </w:p>
         </w:tc>
@@ -13174,7 +13174,7 @@
                 <w:i w:val="0"/>
                 <w:sz w:val="26"/>
               </w:rPr>
-              <w:t>Migration có phiên bản; giao dịch SERIALIZABLE, FOR UPDATE, EXCLUDE</w:t>
+              <w:t>Migration 32 bảng, Session Pooler cổng 5432, sao lưu tự động pg_dump</w:t>
             </w:r>
           </w:p>
         </w:tc>
@@ -17318,7 +17318,7 @@
                 <w:i w:val="0"/>
                 <w:sz w:val="26"/>
               </w:rPr>
-              <w:t>SSE · TypeORM Migration · HoYoSalon Launcher (BẮT ĐẦU / CẬP NHẬT)</w:t>
+              <w:t>Cloud 24/7 (Cloudflare Pages + Render + Supabase) · SSE · Launcher (BẮT ĐẦU / CẬP NHẬT)</w:t>
             </w:r>
           </w:p>
         </w:tc>
@@ -17365,7 +17365,7 @@
                 <w:i w:val="0"/>
                 <w:sz w:val="26"/>
               </w:rPr>
-              <w:t>26 / 26</w:t>
+              <w:t>32 / 32</w:t>
             </w:r>
           </w:p>
         </w:tc>
@@ -21274,6 +21274,414 @@
           </w:p>
         </w:tc>
       </w:tr>
+      <w:tr>
+        <w:trPr>
+          <w:cantSplit w:val="true"/>
+        </w:trPr>
+        <w:tc>
+          <w:tcPr>
+            <w:tcW w:type="dxa" w:w="1474"/>
+            <w:vAlign w:val="center"/>
+          </w:tcPr>
+          <w:p>
+            <w:pPr>
+              <w:spacing w:line="312" w:lineRule="auto" w:after="120"/>
+              <w:jc w:val="center"/>
+            </w:pPr>
+            <w:r>
+              <w:rPr>
+                <w:rFonts w:ascii="Times New Roman" w:hAnsi="Times New Roman" w:eastAsia="Times New Roman" w:cs="Times New Roman"/>
+                <w:b w:val="0"/>
+                <w:i w:val="0"/>
+                <w:sz w:val="26"/>
+              </w:rPr>
+              <w:t>07/10/2026</w:t>
+            </w:r>
+          </w:p>
+        </w:tc>
+        <w:tc>
+          <w:tcPr>
+            <w:tcW w:type="dxa" w:w="1587"/>
+            <w:vAlign w:val="center"/>
+          </w:tcPr>
+          <w:p>
+            <w:pPr>
+              <w:spacing w:line="312" w:lineRule="auto" w:after="120"/>
+              <w:jc w:val="center"/>
+            </w:pPr>
+            <w:r>
+              <w:rPr>
+                <w:rFonts w:ascii="Times New Roman" w:hAnsi="Times New Roman" w:eastAsia="Times New Roman" w:cs="Times New Roman"/>
+                <w:b w:val="0"/>
+                <w:i w:val="0"/>
+                <w:sz w:val="26"/>
+              </w:rPr>
+              <w:t>v1.5.0</w:t>
+            </w:r>
+          </w:p>
+        </w:tc>
+        <w:tc>
+          <w:tcPr>
+            <w:tcW w:type="dxa" w:w="6009"/>
+            <w:vAlign w:val="center"/>
+          </w:tcPr>
+          <w:p>
+            <w:pPr>
+              <w:spacing w:line="312" w:lineRule="auto" w:after="120"/>
+              <w:jc w:val="left"/>
+            </w:pPr>
+            <w:r>
+              <w:rPr>
+                <w:rFonts w:ascii="Times New Roman" w:hAnsi="Times New Roman" w:eastAsia="Times New Roman" w:cs="Times New Roman"/>
+                <w:b w:val="0"/>
+                <w:i w:val="0"/>
+                <w:sz w:val="26"/>
+              </w:rPr>
+              <w:t>Nhật ký hoạt động chi tiết, tự giải phóng cổng bị chiếm khi khởi động</w:t>
+            </w:r>
+          </w:p>
+        </w:tc>
+      </w:tr>
+      <w:tr>
+        <w:trPr>
+          <w:cantSplit w:val="true"/>
+        </w:trPr>
+        <w:tc>
+          <w:tcPr>
+            <w:tcW w:type="dxa" w:w="1474"/>
+            <w:vAlign w:val="center"/>
+          </w:tcPr>
+          <w:p>
+            <w:pPr>
+              <w:spacing w:line="312" w:lineRule="auto" w:after="120"/>
+              <w:jc w:val="center"/>
+            </w:pPr>
+            <w:r>
+              <w:rPr>
+                <w:rFonts w:ascii="Times New Roman" w:hAnsi="Times New Roman" w:eastAsia="Times New Roman" w:cs="Times New Roman"/>
+                <w:b w:val="0"/>
+                <w:i w:val="0"/>
+                <w:sz w:val="26"/>
+              </w:rPr>
+              <w:t>08/10/2026</w:t>
+            </w:r>
+          </w:p>
+        </w:tc>
+        <w:tc>
+          <w:tcPr>
+            <w:tcW w:type="dxa" w:w="1587"/>
+            <w:vAlign w:val="center"/>
+          </w:tcPr>
+          <w:p>
+            <w:pPr>
+              <w:spacing w:line="312" w:lineRule="auto" w:after="120"/>
+              <w:jc w:val="center"/>
+            </w:pPr>
+            <w:r>
+              <w:rPr>
+                <w:rFonts w:ascii="Times New Roman" w:hAnsi="Times New Roman" w:eastAsia="Times New Roman" w:cs="Times New Roman"/>
+                <w:b w:val="0"/>
+                <w:i w:val="0"/>
+                <w:sz w:val="26"/>
+              </w:rPr>
+              <w:t>v1.6.0</w:t>
+            </w:r>
+          </w:p>
+        </w:tc>
+        <w:tc>
+          <w:tcPr>
+            <w:tcW w:type="dxa" w:w="6009"/>
+            <w:vAlign w:val="center"/>
+          </w:tcPr>
+          <w:p>
+            <w:pPr>
+              <w:spacing w:line="312" w:lineRule="auto" w:after="120"/>
+              <w:jc w:val="left"/>
+            </w:pPr>
+            <w:r>
+              <w:rPr>
+                <w:rFonts w:ascii="Times New Roman" w:hAnsi="Times New Roman" w:eastAsia="Times New Roman" w:cs="Times New Roman"/>
+                <w:b w:val="0"/>
+                <w:i w:val="0"/>
+                <w:sz w:val="26"/>
+              </w:rPr>
+              <w:t>Hệ thống đặt lịch Salon Spa hoàn thiện, sao lưu pg_dump tự động</w:t>
+            </w:r>
+          </w:p>
+        </w:tc>
+      </w:tr>
+      <w:tr>
+        <w:trPr>
+          <w:cantSplit w:val="true"/>
+        </w:trPr>
+        <w:tc>
+          <w:tcPr>
+            <w:tcW w:type="dxa" w:w="1474"/>
+            <w:vAlign w:val="center"/>
+          </w:tcPr>
+          <w:p>
+            <w:pPr>
+              <w:spacing w:line="312" w:lineRule="auto" w:after="120"/>
+              <w:jc w:val="center"/>
+            </w:pPr>
+            <w:r>
+              <w:rPr>
+                <w:rFonts w:ascii="Times New Roman" w:hAnsi="Times New Roman" w:eastAsia="Times New Roman" w:cs="Times New Roman"/>
+                <w:b w:val="0"/>
+                <w:i w:val="0"/>
+                <w:sz w:val="26"/>
+              </w:rPr>
+              <w:t>11/10/2026</w:t>
+            </w:r>
+          </w:p>
+        </w:tc>
+        <w:tc>
+          <w:tcPr>
+            <w:tcW w:type="dxa" w:w="1587"/>
+            <w:vAlign w:val="center"/>
+          </w:tcPr>
+          <w:p>
+            <w:pPr>
+              <w:spacing w:line="312" w:lineRule="auto" w:after="120"/>
+              <w:jc w:val="center"/>
+            </w:pPr>
+            <w:r>
+              <w:rPr>
+                <w:rFonts w:ascii="Times New Roman" w:hAnsi="Times New Roman" w:eastAsia="Times New Roman" w:cs="Times New Roman"/>
+                <w:b w:val="0"/>
+                <w:i w:val="0"/>
+                <w:sz w:val="26"/>
+              </w:rPr>
+              <w:t>v2.0.0</w:t>
+            </w:r>
+          </w:p>
+        </w:tc>
+        <w:tc>
+          <w:tcPr>
+            <w:tcW w:type="dxa" w:w="6009"/>
+            <w:vAlign w:val="center"/>
+          </w:tcPr>
+          <w:p>
+            <w:pPr>
+              <w:spacing w:line="312" w:lineRule="auto" w:after="120"/>
+              <w:jc w:val="left"/>
+            </w:pPr>
+            <w:r>
+              <w:rPr>
+                <w:rFonts w:ascii="Times New Roman" w:hAnsi="Times New Roman" w:eastAsia="Times New Roman" w:cs="Times New Roman"/>
+                <w:b w:val="0"/>
+                <w:i w:val="0"/>
+                <w:sz w:val="26"/>
+              </w:rPr>
+              <w:t>AI Local Spark-X2.5-4B, phân trang toàn diện, hoá đơn nhiệt K80</w:t>
+            </w:r>
+          </w:p>
+        </w:tc>
+      </w:tr>
+      <w:tr>
+        <w:trPr>
+          <w:cantSplit w:val="true"/>
+        </w:trPr>
+        <w:tc>
+          <w:tcPr>
+            <w:tcW w:type="dxa" w:w="1474"/>
+            <w:vAlign w:val="center"/>
+          </w:tcPr>
+          <w:p>
+            <w:pPr>
+              <w:spacing w:line="312" w:lineRule="auto" w:after="120"/>
+              <w:jc w:val="center"/>
+            </w:pPr>
+            <w:r>
+              <w:rPr>
+                <w:rFonts w:ascii="Times New Roman" w:hAnsi="Times New Roman" w:eastAsia="Times New Roman" w:cs="Times New Roman"/>
+                <w:b w:val="0"/>
+                <w:i w:val="0"/>
+                <w:sz w:val="26"/>
+              </w:rPr>
+              <w:t>12/10/2026</w:t>
+            </w:r>
+          </w:p>
+        </w:tc>
+        <w:tc>
+          <w:tcPr>
+            <w:tcW w:type="dxa" w:w="1587"/>
+            <w:vAlign w:val="center"/>
+          </w:tcPr>
+          <w:p>
+            <w:pPr>
+              <w:spacing w:line="312" w:lineRule="auto" w:after="120"/>
+              <w:jc w:val="center"/>
+            </w:pPr>
+            <w:r>
+              <w:rPr>
+                <w:rFonts w:ascii="Times New Roman" w:hAnsi="Times New Roman" w:eastAsia="Times New Roman" w:cs="Times New Roman"/>
+                <w:b w:val="0"/>
+                <w:i w:val="0"/>
+                <w:sz w:val="26"/>
+              </w:rPr>
+              <w:t>v2.1.0 – v2.1.1</w:t>
+            </w:r>
+          </w:p>
+        </w:tc>
+        <w:tc>
+          <w:tcPr>
+            <w:tcW w:type="dxa" w:w="6009"/>
+            <w:vAlign w:val="center"/>
+          </w:tcPr>
+          <w:p>
+            <w:pPr>
+              <w:spacing w:line="312" w:lineRule="auto" w:after="120"/>
+              <w:jc w:val="left"/>
+            </w:pPr>
+            <w:r>
+              <w:rPr>
+                <w:rFonts w:ascii="Times New Roman" w:hAnsi="Times New Roman" w:eastAsia="Times New Roman" w:cs="Times New Roman"/>
+                <w:b w:val="0"/>
+                <w:i w:val="0"/>
+                <w:sz w:val="26"/>
+              </w:rPr>
+              <w:t>AI local 1 chạm, vòng tự cải tiến có duyệt, tự chuyển CPU/GPU</w:t>
+            </w:r>
+          </w:p>
+        </w:tc>
+      </w:tr>
+      <w:tr>
+        <w:trPr>
+          <w:cantSplit w:val="true"/>
+        </w:trPr>
+        <w:tc>
+          <w:tcPr>
+            <w:tcW w:type="dxa" w:w="1474"/>
+            <w:vAlign w:val="center"/>
+          </w:tcPr>
+          <w:p>
+            <w:pPr>
+              <w:spacing w:line="312" w:lineRule="auto" w:after="120"/>
+              <w:jc w:val="center"/>
+            </w:pPr>
+            <w:r>
+              <w:rPr>
+                <w:rFonts w:ascii="Times New Roman" w:hAnsi="Times New Roman" w:eastAsia="Times New Roman" w:cs="Times New Roman"/>
+                <w:b w:val="0"/>
+                <w:i w:val="0"/>
+                <w:sz w:val="26"/>
+              </w:rPr>
+              <w:t>13/10/2026</w:t>
+            </w:r>
+          </w:p>
+        </w:tc>
+        <w:tc>
+          <w:tcPr>
+            <w:tcW w:type="dxa" w:w="1587"/>
+            <w:vAlign w:val="center"/>
+          </w:tcPr>
+          <w:p>
+            <w:pPr>
+              <w:spacing w:line="312" w:lineRule="auto" w:after="120"/>
+              <w:jc w:val="center"/>
+            </w:pPr>
+            <w:r>
+              <w:rPr>
+                <w:rFonts w:ascii="Times New Roman" w:hAnsi="Times New Roman" w:eastAsia="Times New Roman" w:cs="Times New Roman"/>
+                <w:b w:val="0"/>
+                <w:i w:val="0"/>
+                <w:sz w:val="26"/>
+              </w:rPr>
+              <w:t>v2.2.0</w:t>
+            </w:r>
+          </w:p>
+        </w:tc>
+        <w:tc>
+          <w:tcPr>
+            <w:tcW w:type="dxa" w:w="6009"/>
+            <w:vAlign w:val="center"/>
+          </w:tcPr>
+          <w:p>
+            <w:pPr>
+              <w:spacing w:line="312" w:lineRule="auto" w:after="120"/>
+              <w:jc w:val="left"/>
+            </w:pPr>
+            <w:r>
+              <w:rPr>
+                <w:rFonts w:ascii="Times New Roman" w:hAnsi="Times New Roman" w:eastAsia="Times New Roman" w:cs="Times New Roman"/>
+                <w:b w:val="0"/>
+                <w:i w:val="0"/>
+                <w:sz w:val="26"/>
+              </w:rPr>
+              <w:t>Kéo thả kiểu Jira cho lịch hẹn và bảng ca làm, QR chia sẻ link 1 chạm</w:t>
+            </w:r>
+          </w:p>
+        </w:tc>
+      </w:tr>
+      <w:tr>
+        <w:trPr>
+          <w:cantSplit w:val="true"/>
+        </w:trPr>
+        <w:tc>
+          <w:tcPr>
+            <w:tcW w:type="dxa" w:w="1474"/>
+            <w:vAlign w:val="center"/>
+          </w:tcPr>
+          <w:p>
+            <w:pPr>
+              <w:spacing w:line="312" w:lineRule="auto" w:after="120"/>
+              <w:jc w:val="center"/>
+            </w:pPr>
+            <w:r>
+              <w:rPr>
+                <w:rFonts w:ascii="Times New Roman" w:hAnsi="Times New Roman" w:eastAsia="Times New Roman" w:cs="Times New Roman"/>
+                <w:b w:val="0"/>
+                <w:i w:val="0"/>
+                <w:sz w:val="26"/>
+              </w:rPr>
+              <w:t>15/10/2026</w:t>
+            </w:r>
+          </w:p>
+        </w:tc>
+        <w:tc>
+          <w:tcPr>
+            <w:tcW w:type="dxa" w:w="1587"/>
+            <w:vAlign w:val="center"/>
+          </w:tcPr>
+          <w:p>
+            <w:pPr>
+              <w:spacing w:line="312" w:lineRule="auto" w:after="120"/>
+              <w:jc w:val="center"/>
+            </w:pPr>
+            <w:r>
+              <w:rPr>
+                <w:rFonts w:ascii="Times New Roman" w:hAnsi="Times New Roman" w:eastAsia="Times New Roman" w:cs="Times New Roman"/>
+                <w:b w:val="0"/>
+                <w:i w:val="0"/>
+                <w:sz w:val="26"/>
+              </w:rPr>
+              <w:t>v2.2.1</w:t>
+            </w:r>
+          </w:p>
+        </w:tc>
+        <w:tc>
+          <w:tcPr>
+            <w:tcW w:type="dxa" w:w="6009"/>
+            <w:vAlign w:val="center"/>
+          </w:tcPr>
+          <w:p>
+            <w:pPr>
+              <w:spacing w:line="312" w:lineRule="auto" w:after="120"/>
+              <w:jc w:val="left"/>
+            </w:pPr>
+            <w:r>
+              <w:rPr>
+                <w:rFonts w:ascii="Times New Roman" w:hAnsi="Times New Roman" w:eastAsia="Times New Roman" w:cs="Times New Roman"/>
+                <w:b w:val="0"/>
+                <w:i w:val="0"/>
+                <w:sz w:val="26"/>
+              </w:rPr>
+              <w:t>Triển khai đám mây 24/7 (Cloudflare Pages https://huongsen-salon.pages.dev, Render API https://salon-spa-api-93d7.onrender.com, Supabase DB, Worker giữ thức)</w:t>
+            </w:r>
+          </w:p>
+        </w:tc>
+      </w:tr>
     </w:tbl>
     <w:p>
       <w:pPr>
@@ -21437,7 +21845,78 @@
                 <w:i w:val="0"/>
                 <w:sz w:val="26"/>
               </w:rPr>
-              <w:t>Quản trị hệ thống</w:t>
+              <w:t>Quản trị hệ thống (Cloud)</w:t>
+            </w:r>
+          </w:p>
+        </w:tc>
+        <w:tc>
+          <w:tcPr>
+            <w:tcW w:type="dxa" w:w="4139"/>
+            <w:vAlign w:val="center"/>
+          </w:tcPr>
+          <w:p>
+            <w:pPr>
+              <w:keepNext/>
+              <w:spacing w:line="312" w:lineRule="auto" w:after="120"/>
+              <w:jc w:val="left"/>
+            </w:pPr>
+            <w:r>
+              <w:rPr>
+                <w:rFonts w:ascii="Times New Roman" w:hAnsi="Times New Roman" w:eastAsia="Times New Roman" w:cs="Times New Roman"/>
+                <w:b w:val="0"/>
+                <w:i w:val="0"/>
+                <w:sz w:val="26"/>
+              </w:rPr>
+              <w:t>admin@salon.vn</w:t>
+            </w:r>
+          </w:p>
+        </w:tc>
+        <w:tc>
+          <w:tcPr>
+            <w:tcW w:type="dxa" w:w="2551"/>
+            <w:vAlign w:val="center"/>
+          </w:tcPr>
+          <w:p>
+            <w:pPr>
+              <w:keepNext/>
+              <w:spacing w:line="312" w:lineRule="auto" w:after="120"/>
+              <w:jc w:val="center"/>
+            </w:pPr>
+            <w:r>
+              <w:rPr>
+                <w:rFonts w:ascii="Times New Roman" w:hAnsi="Times New Roman" w:eastAsia="Times New Roman" w:cs="Times New Roman"/>
+                <w:b w:val="0"/>
+                <w:i w:val="0"/>
+                <w:sz w:val="26"/>
+              </w:rPr>
+              <w:t>Admin@123456</w:t>
+            </w:r>
+          </w:p>
+        </w:tc>
+      </w:tr>
+      <w:tr>
+        <w:trPr>
+          <w:cantSplit w:val="true"/>
+        </w:trPr>
+        <w:tc>
+          <w:tcPr>
+            <w:tcW w:type="dxa" w:w="2381"/>
+            <w:vAlign w:val="center"/>
+          </w:tcPr>
+          <w:p>
+            <w:pPr>
+              <w:keepNext/>
+              <w:spacing w:line="312" w:lineRule="auto" w:after="120"/>
+              <w:jc w:val="left"/>
+            </w:pPr>
+            <w:r>
+              <w:rPr>
+                <w:rFonts w:ascii="Times New Roman" w:hAnsi="Times New Roman" w:eastAsia="Times New Roman" w:cs="Times New Roman"/>
+                <w:b w:val="0"/>
+                <w:i w:val="0"/>
+                <w:sz w:val="26"/>
+              </w:rPr>
+              <w:t>Quản trị hệ thống (Local)</w:t>
             </w:r>
           </w:p>
         </w:tc>
@@ -23506,6 +23985,190 @@
           <w:sz w:val="26"/>
         </w:rPr>
         <w:t>Đồng hồ giữ chỗ ở bước Xác nhận và trang chủ với chân trang mới</w:t>
+      </w:r>
+    </w:p>
+    <w:p>
+      <w:pPr>
+        <w:pStyle w:val="Heading2"/>
+      </w:pPr>
+      <w:r>
+        <w:rPr>
+          <w:rFonts w:ascii="Times New Roman" w:hAnsi="Times New Roman" w:eastAsia="Times New Roman" w:cs="Times New Roman"/>
+          <w:b/>
+          <w:sz w:val="28"/>
+        </w:rPr>
+        <w:t>4.9. Triển khai hạ tầng đám mây 24/7 (v2.2.1)</w:t>
+      </w:r>
+    </w:p>
+    <w:p>
+      <w:pPr>
+        <w:ind w:firstLine="720"/>
+        <w:jc w:val="both"/>
+      </w:pPr>
+      <w:r>
+        <w:rPr>
+          <w:rFonts w:ascii="Times New Roman" w:hAnsi="Times New Roman" w:eastAsia="Times New Roman" w:cs="Times New Roman"/>
+          <w:b w:val="0"/>
+          <w:i w:val="0"/>
+          <w:sz w:val="26"/>
+        </w:rPr>
+        <w:t>Để phục vụ nghiệm thu thực tế và người dùng truy cập mọi lúc mọi nơi mà không cần duy trì máy chủ cục bộ, hệ thống đã được thiết lập kiến trúc triển khai đám mây hoàn chỉnh 24/7, kết hợp các thành phần dịch vụ hiện đại:</w:t>
+      </w:r>
+    </w:p>
+    <w:p>
+      <w:pPr>
+        <w:pStyle w:val="ListBullet"/>
+        <w:jc w:val="both"/>
+      </w:pPr>
+      <w:r>
+        <w:rPr>
+          <w:rFonts w:ascii="Times New Roman" w:hAnsi="Times New Roman" w:eastAsia="Times New Roman" w:cs="Times New Roman"/>
+          <w:b/>
+          <w:i w:val="0"/>
+          <w:sz w:val="26"/>
+        </w:rPr>
+        <w:t>Cloudflare Pages (Giao diện Frontend)</w:t>
+      </w:r>
+      <w:r>
+        <w:rPr>
+          <w:rFonts w:ascii="Times New Roman" w:hAnsi="Times New Roman" w:eastAsia="Times New Roman" w:cs="Times New Roman"/>
+          <w:b w:val="0"/>
+          <w:i w:val="0"/>
+          <w:sz w:val="26"/>
+        </w:rPr>
+        <w:t xml:space="preserve">: Triển khai bản dựng tĩnh React 18 + Vite lên mạng lưới CDN toàn cầu tại địa chỉ </w:t>
+      </w:r>
+      <w:r>
+        <w:rPr>
+          <w:rFonts w:ascii="Times New Roman" w:hAnsi="Times New Roman" w:eastAsia="Times New Roman" w:cs="Times New Roman"/>
+          <w:b w:val="0"/>
+          <w:i w:val="0"/>
+          <w:sz w:val="26"/>
+        </w:rPr>
+        <w:t>https://huongsen-salon.pages.dev</w:t>
+      </w:r>
+      <w:r>
+        <w:rPr>
+          <w:rFonts w:ascii="Times New Roman" w:hAnsi="Times New Roman" w:eastAsia="Times New Roman" w:cs="Times New Roman"/>
+          <w:b w:val="0"/>
+          <w:i w:val="0"/>
+          <w:sz w:val="26"/>
+        </w:rPr>
+        <w:t>, tối ưu tốc độ tải trang dưới 1 giây, tự động kích hoạt triển khai khi đẩy mã nguồn.</w:t>
+      </w:r>
+    </w:p>
+    <w:p>
+      <w:pPr>
+        <w:pStyle w:val="ListBullet"/>
+        <w:jc w:val="both"/>
+      </w:pPr>
+      <w:r>
+        <w:rPr>
+          <w:rFonts w:ascii="Times New Roman" w:hAnsi="Times New Roman" w:eastAsia="Times New Roman" w:cs="Times New Roman"/>
+          <w:b/>
+          <w:i w:val="0"/>
+          <w:sz w:val="26"/>
+        </w:rPr>
+        <w:t>Render Web Service (Máy chủ Backend API)</w:t>
+      </w:r>
+      <w:r>
+        <w:rPr>
+          <w:rFonts w:ascii="Times New Roman" w:hAnsi="Times New Roman" w:eastAsia="Times New Roman" w:cs="Times New Roman"/>
+          <w:b w:val="0"/>
+          <w:i w:val="0"/>
+          <w:sz w:val="26"/>
+        </w:rPr>
+        <w:t xml:space="preserve">: Vận hành NestJS 10 REST API tại </w:t>
+      </w:r>
+      <w:r>
+        <w:rPr>
+          <w:rFonts w:ascii="Times New Roman" w:hAnsi="Times New Roman" w:eastAsia="Times New Roman" w:cs="Times New Roman"/>
+          <w:b w:val="0"/>
+          <w:i w:val="0"/>
+          <w:sz w:val="26"/>
+        </w:rPr>
+        <w:t>https://salon-spa-api-93d7.onrender.com</w:t>
+      </w:r>
+      <w:r>
+        <w:rPr>
+          <w:rFonts w:ascii="Times New Roman" w:hAnsi="Times New Roman" w:eastAsia="Times New Roman" w:cs="Times New Roman"/>
+          <w:b w:val="0"/>
+          <w:i w:val="0"/>
+          <w:sz w:val="26"/>
+        </w:rPr>
+        <w:t>, kết nối cơ sở dữ liệu qua biến môi trường an toàn, cung cấp đầy đủ các cổng dịch vụ nghiệp vụ, xác thực JWT và kiểm tra sức khoẻ (/health/live).</w:t>
+      </w:r>
+    </w:p>
+    <w:p>
+      <w:pPr>
+        <w:pStyle w:val="ListBullet"/>
+        <w:jc w:val="both"/>
+      </w:pPr>
+      <w:r>
+        <w:rPr>
+          <w:rFonts w:ascii="Times New Roman" w:hAnsi="Times New Roman" w:eastAsia="Times New Roman" w:cs="Times New Roman"/>
+          <w:b/>
+          <w:i w:val="0"/>
+          <w:sz w:val="26"/>
+        </w:rPr>
+        <w:t>Supabase Database (PostgreSQL 17.11)</w:t>
+      </w:r>
+      <w:r>
+        <w:rPr>
+          <w:rFonts w:ascii="Times New Roman" w:hAnsi="Times New Roman" w:eastAsia="Times New Roman" w:cs="Times New Roman"/>
+          <w:b w:val="0"/>
+          <w:i w:val="0"/>
+          <w:sz w:val="26"/>
+        </w:rPr>
+        <w:t>: Cơ sở dữ liệu đám mây tại vùng Sydney (ap-southeast-2), quản trị 32 bảng, sử dụng Session Pooler bảo đảm khả năng chịu tải kết nối ổn định.</w:t>
+      </w:r>
+    </w:p>
+    <w:p>
+      <w:pPr>
+        <w:pStyle w:val="ListBullet"/>
+        <w:jc w:val="both"/>
+      </w:pPr>
+      <w:r>
+        <w:rPr>
+          <w:rFonts w:ascii="Times New Roman" w:hAnsi="Times New Roman" w:eastAsia="Times New Roman" w:cs="Times New Roman"/>
+          <w:b/>
+          <w:i w:val="0"/>
+          <w:sz w:val="26"/>
+        </w:rPr>
+        <w:t>Cloudflare Worker Keepalive (Bộ duy trì trực tuyến)</w:t>
+      </w:r>
+      <w:r>
+        <w:rPr>
+          <w:rFonts w:ascii="Times New Roman" w:hAnsi="Times New Roman" w:eastAsia="Times New Roman" w:cs="Times New Roman"/>
+          <w:b w:val="0"/>
+          <w:i w:val="0"/>
+          <w:sz w:val="26"/>
+        </w:rPr>
+        <w:t>: Vận hành kịch bản cron định kỳ 10 phút/lần gọi tự động vào endpoint kiểm tra sức khoẻ của Render, loại bỏ hoàn toàn độ trễ khởi động nguội (cold start), đảm bảo hệ thống phản hồi tức thì 24/7.</w:t>
+      </w:r>
+    </w:p>
+    <w:p>
+      <w:pPr>
+        <w:pStyle w:val="ListBullet"/>
+        <w:jc w:val="both"/>
+      </w:pPr>
+      <w:r>
+        <w:rPr>
+          <w:rFonts w:ascii="Times New Roman" w:hAnsi="Times New Roman" w:eastAsia="Times New Roman" w:cs="Times New Roman"/>
+          <w:b/>
+          <w:i w:val="0"/>
+          <w:sz w:val="26"/>
+        </w:rPr>
+        <w:t>Tích hợp MCP Servers (Model Context Protocol)</w:t>
+      </w:r>
+      <w:r>
+        <w:rPr>
+          <w:rFonts w:ascii="Times New Roman" w:hAnsi="Times New Roman" w:eastAsia="Times New Roman" w:cs="Times New Roman"/>
+          <w:b w:val="0"/>
+          <w:i w:val="0"/>
+          <w:sz w:val="26"/>
+        </w:rPr>
+        <w:t>: Thiết lập cấu hình Render MCP và Cloudflare MCP cho phép trợ lý giám sát, kiểm tra tài nguyên và nhật ký hệ thống trực tiếp từ môi trường IDE.</w:t>
       </w:r>
     </w:p>
     <w:p>

</xml_diff>

<commit_message>
docs: dong bo so lieu bao cao Word va slide PPT len v3.0.0 (385 Unit tests, 155 E2E)
</commit_message>
<xml_diff>
--- a/docs/reports/Bao_Cao_Thuc_Tap_He_Thong_Dat_Lich_Salon_Spa.docx
+++ b/docs/reports/Bao_Cao_Thuc_Tap_He_Thong_Dat_Lich_Salon_Spa.docx
@@ -17060,7 +17060,7 @@
           <w:i/>
           <w:sz w:val="26"/>
         </w:rPr>
-        <w:t>Phạm vi và kiểm định hệ thống ngày 06/10/2026</w:t>
+        <w:t>Phạm vi và kiểm định hệ thống ngày 16/10/2026</w:t>
       </w:r>
     </w:p>
     <w:tbl>
@@ -17412,7 +17412,7 @@
                 <w:i w:val="0"/>
                 <w:sz w:val="26"/>
               </w:rPr>
-              <w:t>168 / 95 (13 bộ) / 4 + 4</w:t>
+              <w:t>385 (331 BE + 54 FE) / 155 (13 bộ) / 4 + 4</w:t>
             </w:r>
           </w:p>
         </w:tc>
@@ -21682,6 +21682,74 @@
           </w:p>
         </w:tc>
       </w:tr>
+      <w:tr>
+        <w:trPr>
+          <w:cantSplit w:val="true"/>
+        </w:trPr>
+        <w:tc>
+          <w:tcPr>
+            <w:tcW w:type="dxa" w:w="1474"/>
+            <w:vAlign w:val="center"/>
+          </w:tcPr>
+          <w:p>
+            <w:pPr>
+              <w:spacing w:line="312" w:lineRule="auto" w:after="120"/>
+              <w:jc w:val="center"/>
+            </w:pPr>
+            <w:r>
+              <w:rPr>
+                <w:rFonts w:ascii="Times New Roman" w:hAnsi="Times New Roman" w:eastAsia="Times New Roman" w:cs="Times New Roman"/>
+                <w:b w:val="0"/>
+                <w:i w:val="0"/>
+                <w:sz w:val="26"/>
+              </w:rPr>
+              <w:t>16/10/2026</w:t>
+            </w:r>
+          </w:p>
+        </w:tc>
+        <w:tc>
+          <w:tcPr>
+            <w:tcW w:type="dxa" w:w="1587"/>
+            <w:vAlign w:val="center"/>
+          </w:tcPr>
+          <w:p>
+            <w:pPr>
+              <w:spacing w:line="312" w:lineRule="auto" w:after="120"/>
+              <w:jc w:val="center"/>
+            </w:pPr>
+            <w:r>
+              <w:rPr>
+                <w:rFonts w:ascii="Times New Roman" w:hAnsi="Times New Roman" w:eastAsia="Times New Roman" w:cs="Times New Roman"/>
+                <w:b w:val="0"/>
+                <w:i w:val="0"/>
+                <w:sz w:val="26"/>
+              </w:rPr>
+              <w:t>v3.0.0</w:t>
+            </w:r>
+          </w:p>
+        </w:tc>
+        <w:tc>
+          <w:tcPr>
+            <w:tcW w:type="dxa" w:w="6009"/>
+            <w:vAlign w:val="center"/>
+          </w:tcPr>
+          <w:p>
+            <w:pPr>
+              <w:spacing w:line="312" w:lineRule="auto" w:after="120"/>
+              <w:jc w:val="left"/>
+            </w:pPr>
+            <w:r>
+              <w:rPr>
+                <w:rFonts w:ascii="Times New Roman" w:hAnsi="Times New Roman" w:eastAsia="Times New Roman" w:cs="Times New Roman"/>
+                <w:b w:val="0"/>
+                <w:i w:val="0"/>
+                <w:sz w:val="26"/>
+              </w:rPr>
+              <w:t>Giao diện Lotus Ivory &amp; Champagne Luxe $10.000, Slot Radar, Command Palette Ctrl+K, SWR cache chống race condition, rate-limit isolation, 385 Unit tests (331 BE + 54 FE), 155 E2E tests, Cloud 24/7 đồng bộ</w:t>
+            </w:r>
+          </w:p>
+        </w:tc>
+      </w:tr>
     </w:tbl>
     <w:p>
       <w:pPr>
@@ -24867,7 +24935,7 @@
                 <w:i w:val="0"/>
                 <w:sz w:val="26"/>
               </w:rPr>
-              <w:t>168 / 168 đạt</w:t>
+              <w:t>385 / 385 đạt</w:t>
             </w:r>
           </w:p>
         </w:tc>
@@ -24935,7 +25003,7 @@
                 <w:i w:val="0"/>
                 <w:sz w:val="26"/>
               </w:rPr>
-              <w:t>95 / 95 đạt</w:t>
+              <w:t>155 / 155 đạt</w:t>
             </w:r>
           </w:p>
         </w:tc>
@@ -25337,7 +25405,7 @@
           <w:i w:val="0"/>
           <w:sz w:val="26"/>
         </w:rPr>
-        <w:t xml:space="preserve">Snapshot kiểm định ngày 06/10/2026. E2E tự tạo và xoá CSDL riêng có hậu tố </w:t>
+        <w:t xml:space="preserve">Snapshot kiểm định ngày 16/10/2026. E2E tự tạo và xoá CSDL riêng có hậu tố </w:t>
       </w:r>
       <w:r>
         <w:rPr>

</xml_diff>

<commit_message>
release: v3.1.0 - Giao dien Lotus Ivory & Champagne Luxe 10.000$, headless deploy Cloudflare Pages 24/7 va dong bo bao cao
</commit_message>
<xml_diff>
--- a/docs/reports/Bao_Cao_Thuc_Tap_He_Thong_Dat_Lich_Salon_Spa.docx
+++ b/docs/reports/Bao_Cao_Thuc_Tap_He_Thong_Dat_Lich_Salon_Spa.docx
@@ -21635,7 +21635,7 @@
                 <w:i w:val="0"/>
                 <w:sz w:val="26"/>
               </w:rPr>
-              <w:t>15/10/2026</w:t>
+              <w:t>16/10/2026</w:t>
             </w:r>
           </w:p>
         </w:tc>
@@ -21656,7 +21656,7 @@
                 <w:i w:val="0"/>
                 <w:sz w:val="26"/>
               </w:rPr>
-              <w:t>v2.2.1</w:t>
+              <w:t>v3.0.0</w:t>
             </w:r>
           </w:p>
         </w:tc>
@@ -21677,7 +21677,7 @@
                 <w:i w:val="0"/>
                 <w:sz w:val="26"/>
               </w:rPr>
-              <w:t>Triển khai đám mây 24/7 (Cloudflare Pages https://huongsen-salon.pages.dev, Render API https://salon-spa-api-93d7.onrender.com, Supabase DB, Worker giữ thức)</w:t>
+              <w:t>Giao diện Lotus Noir 10.000$, Trợ lý AI nâng cao và tối ưu hiệu năng</w:t>
             </w:r>
           </w:p>
         </w:tc>
@@ -21724,7 +21724,7 @@
                 <w:i w:val="0"/>
                 <w:sz w:val="26"/>
               </w:rPr>
-              <w:t>v3.0.0</w:t>
+              <w:t>v3.1.0</w:t>
             </w:r>
           </w:p>
         </w:tc>
@@ -21745,7 +21745,7 @@
                 <w:i w:val="0"/>
                 <w:sz w:val="26"/>
               </w:rPr>
-              <w:t>Giao diện Lotus Ivory &amp; Champagne Luxe $10.000, Slot Radar, Command Palette Ctrl+K, SWR cache chống race condition, rate-limit isolation, 385 Unit tests (331 BE + 54 FE), 155 E2E tests, Cloud 24/7 đồng bộ</w:t>
+              <w:t>Giao diện sáng Lotus Ivory &amp; Champagne Luxe $10.000, Slot Radar, Ctrl+K, SWR cache, deploy headless Cloudflare Pages 24/7, 385 Unit tests, 155 E2E tests</w:t>
             </w:r>
           </w:p>
         </w:tc>

</xml_diff>